<commit_message>
feat: actualización completa de módulos ERP/CRM, Centro de Reportes y sincronización con TiDB
</commit_message>
<xml_diff>
--- a/docs/DOCUMENTO DE ESPECIFICACIÓN TÉCNICO.docx
+++ b/docs/DOCUMENTO DE ESPECIFICACIÓN TÉCNICO.docx
@@ -2472,8 +2472,6 @@
       </w:pPr>
       <w:r>
         <w:tab/>
-      </w:r>
-      <w:r>
         <w:t>1. Actualización para el Documento Funcional</w:t>
       </w:r>
     </w:p>
@@ -2868,10 +2866,1569 @@
       <w:r>
         <w:t>Tarea 2: Dinamización del Panel de Actividad y Estado de Caja</w:t>
       </w:r>
+    </w:p>
+    <w:p>
+      <w:r>
+        <w:br w:type="page"/>
+      </w:r>
+    </w:p>
+    <w:p>
+      <w:pPr>
+        <w:pStyle w:val="Ttulo3"/>
+      </w:pPr>
+      <w:r>
+        <w:lastRenderedPageBreak/>
+        <w:t>Análisis Detallado por Módulo</w:t>
+      </w:r>
+    </w:p>
+    <w:p>
+      <w:pPr>
+        <w:pStyle w:val="NormalWeb"/>
+        <w:numPr>
+          <w:ilvl w:val="0"/>
+          <w:numId w:val="11"/>
+        </w:numPr>
+      </w:pPr>
+      <w:r>
+        <w:rPr>
+          <w:b/>
+          <w:bCs/>
+        </w:rPr>
+        <w:t>Catálogo de Productos (</w:t>
+      </w:r>
+      <w:r>
+        <w:rPr>
+          <w:rStyle w:val="CdigoHTML"/>
+          <w:b/>
+          <w:bCs/>
+        </w:rPr>
+        <w:t>productos.txt</w:t>
+      </w:r>
+      <w:r>
+        <w:rPr>
+          <w:b/>
+          <w:bCs/>
+        </w:rPr>
+        <w:t>)</w:t>
+      </w:r>
+      <w:r>
+        <w:t>:</w:t>
+      </w:r>
+    </w:p>
+    <w:p>
+      <w:pPr>
+        <w:pStyle w:val="NormalWeb"/>
+        <w:numPr>
+          <w:ilvl w:val="1"/>
+          <w:numId w:val="11"/>
+        </w:numPr>
+      </w:pPr>
+      <w:r>
+        <w:t xml:space="preserve">Consume datos mediante llamadas a acciones de servidor como </w:t>
+      </w:r>
+      <w:proofErr w:type="spellStart"/>
+      <w:r>
+        <w:rPr>
+          <w:rStyle w:val="CdigoHTML"/>
+        </w:rPr>
+        <w:t>getProducts</w:t>
+      </w:r>
+      <w:proofErr w:type="spellEnd"/>
+      <w:r>
+        <w:t xml:space="preserve">, </w:t>
+      </w:r>
+      <w:proofErr w:type="spellStart"/>
+      <w:r>
+        <w:rPr>
+          <w:rStyle w:val="CdigoHTML"/>
+        </w:rPr>
+        <w:t>getCategories</w:t>
+      </w:r>
+      <w:proofErr w:type="spellEnd"/>
+      <w:r>
+        <w:t xml:space="preserve"> y </w:t>
+      </w:r>
+      <w:proofErr w:type="spellStart"/>
+      <w:r>
+        <w:rPr>
+          <w:rStyle w:val="CdigoHTML"/>
+        </w:rPr>
+        <w:t>getSuppliers</w:t>
+      </w:r>
+      <w:proofErr w:type="spellEnd"/>
+      <w:r>
+        <w:t xml:space="preserve">. </w:t>
+      </w:r>
+    </w:p>
+    <w:p>
+      <w:pPr>
+        <w:pStyle w:val="NormalWeb"/>
+        <w:numPr>
+          <w:ilvl w:val="1"/>
+          <w:numId w:val="11"/>
+        </w:numPr>
+      </w:pPr>
+      <w:r>
+        <w:t xml:space="preserve">El manejo de precios, stock, márgenes e imágenes base64 está completamente automatizado y sincronizado con la base de datos. </w:t>
+      </w:r>
+    </w:p>
+    <w:p>
+      <w:pPr>
+        <w:pStyle w:val="NormalWeb"/>
+        <w:numPr>
+          <w:ilvl w:val="0"/>
+          <w:numId w:val="11"/>
+        </w:numPr>
+      </w:pPr>
+      <w:r>
+        <w:rPr>
+          <w:b/>
+          <w:bCs/>
+        </w:rPr>
+        <w:t>Vivero / Mostrador de Ventas (</w:t>
+      </w:r>
+      <w:r>
+        <w:rPr>
+          <w:rStyle w:val="CdigoHTML"/>
+          <w:b/>
+          <w:bCs/>
+        </w:rPr>
+        <w:t>vivero.txt</w:t>
+      </w:r>
+      <w:r>
+        <w:rPr>
+          <w:b/>
+          <w:bCs/>
+        </w:rPr>
+        <w:t xml:space="preserve"> y </w:t>
+      </w:r>
+      <w:r>
+        <w:rPr>
+          <w:rStyle w:val="CdigoHTML"/>
+          <w:b/>
+          <w:bCs/>
+        </w:rPr>
+        <w:t>ventas.txt</w:t>
+      </w:r>
+      <w:r>
+        <w:rPr>
+          <w:b/>
+          <w:bCs/>
+        </w:rPr>
+        <w:t>)</w:t>
+      </w:r>
+      <w:r>
+        <w:t>:</w:t>
+      </w:r>
+    </w:p>
+    <w:p>
+      <w:pPr>
+        <w:pStyle w:val="NormalWeb"/>
+        <w:numPr>
+          <w:ilvl w:val="1"/>
+          <w:numId w:val="11"/>
+        </w:numPr>
+      </w:pPr>
+      <w:r>
+        <w:t xml:space="preserve">Obtiene el inventario en tiempo real mediante </w:t>
+      </w:r>
+      <w:proofErr w:type="spellStart"/>
+      <w:r>
+        <w:rPr>
+          <w:rStyle w:val="CdigoHTML"/>
+        </w:rPr>
+        <w:t>getProducts</w:t>
+      </w:r>
+      <w:proofErr w:type="spellEnd"/>
+      <w:r>
+        <w:t xml:space="preserve">. </w:t>
+      </w:r>
+    </w:p>
+    <w:p>
+      <w:pPr>
+        <w:pStyle w:val="NormalWeb"/>
+        <w:numPr>
+          <w:ilvl w:val="1"/>
+          <w:numId w:val="11"/>
+        </w:numPr>
+      </w:pPr>
+      <w:r>
+        <w:t>Consulta clientes y parámetros de la tienda desde rutas API dedicadas (</w:t>
+      </w:r>
+      <w:r>
+        <w:rPr>
+          <w:rStyle w:val="CdigoHTML"/>
+        </w:rPr>
+        <w:t>/api/</w:t>
+      </w:r>
+      <w:proofErr w:type="spellStart"/>
+      <w:r>
+        <w:rPr>
+          <w:rStyle w:val="CdigoHTML"/>
+        </w:rPr>
+        <w:t>customers</w:t>
+      </w:r>
+      <w:proofErr w:type="spellEnd"/>
+      <w:r>
+        <w:t xml:space="preserve">, </w:t>
+      </w:r>
+      <w:r>
+        <w:rPr>
+          <w:rStyle w:val="CdigoHTML"/>
+        </w:rPr>
+        <w:t>/api/</w:t>
+      </w:r>
+      <w:proofErr w:type="spellStart"/>
+      <w:r>
+        <w:rPr>
+          <w:rStyle w:val="CdigoHTML"/>
+        </w:rPr>
+        <w:t>settings</w:t>
+      </w:r>
+      <w:proofErr w:type="spellEnd"/>
+      <w:r>
+        <w:t xml:space="preserve">). </w:t>
+      </w:r>
+    </w:p>
+    <w:p>
+      <w:pPr>
+        <w:pStyle w:val="NormalWeb"/>
+        <w:numPr>
+          <w:ilvl w:val="1"/>
+          <w:numId w:val="11"/>
+        </w:numPr>
+      </w:pPr>
+      <w:r>
+        <w:t xml:space="preserve">Registra operaciones comerciales reales enviando los datos a través de Server </w:t>
+      </w:r>
+      <w:proofErr w:type="spellStart"/>
+      <w:r>
+        <w:t>Actions</w:t>
+      </w:r>
+      <w:proofErr w:type="spellEnd"/>
+      <w:r>
+        <w:t xml:space="preserve"> como </w:t>
+      </w:r>
+      <w:proofErr w:type="spellStart"/>
+      <w:r>
+        <w:rPr>
+          <w:rStyle w:val="CdigoHTML"/>
+        </w:rPr>
+        <w:t>createSale</w:t>
+      </w:r>
+      <w:proofErr w:type="spellEnd"/>
+      <w:r>
+        <w:t xml:space="preserve">. </w:t>
+      </w:r>
+    </w:p>
+    <w:p>
+      <w:pPr>
+        <w:pStyle w:val="NormalWeb"/>
+        <w:numPr>
+          <w:ilvl w:val="0"/>
+          <w:numId w:val="11"/>
+        </w:numPr>
+      </w:pPr>
+      <w:r>
+        <w:rPr>
+          <w:b/>
+          <w:bCs/>
+        </w:rPr>
+        <w:t>Caja Diaria y Arqueo (</w:t>
+      </w:r>
+      <w:r>
+        <w:rPr>
+          <w:rStyle w:val="CdigoHTML"/>
+          <w:b/>
+          <w:bCs/>
+        </w:rPr>
+        <w:t>caja.txt</w:t>
+      </w:r>
+      <w:r>
+        <w:rPr>
+          <w:b/>
+          <w:bCs/>
+        </w:rPr>
+        <w:t>)</w:t>
+      </w:r>
+      <w:r>
+        <w:t>:</w:t>
+      </w:r>
+    </w:p>
+    <w:p>
+      <w:pPr>
+        <w:pStyle w:val="NormalWeb"/>
+        <w:numPr>
+          <w:ilvl w:val="1"/>
+          <w:numId w:val="11"/>
+        </w:numPr>
+      </w:pPr>
+      <w:r>
+        <w:t xml:space="preserve">Calcula de forma dinámica los totales, medios de pago y movimientos mediante la acción </w:t>
+      </w:r>
+      <w:proofErr w:type="spellStart"/>
+      <w:r>
+        <w:rPr>
+          <w:rStyle w:val="CdigoHTML"/>
+        </w:rPr>
+        <w:t>getCajaSummary</w:t>
+      </w:r>
+      <w:proofErr w:type="spellEnd"/>
+      <w:r>
+        <w:t xml:space="preserve">. </w:t>
+      </w:r>
+    </w:p>
+    <w:p>
+      <w:pPr>
+        <w:pStyle w:val="NormalWeb"/>
+        <w:numPr>
+          <w:ilvl w:val="1"/>
+          <w:numId w:val="11"/>
+        </w:numPr>
+      </w:pPr>
+      <w:r>
+        <w:t xml:space="preserve">Controla el bloqueo diario consultando el estado con </w:t>
+      </w:r>
+      <w:proofErr w:type="spellStart"/>
+      <w:r>
+        <w:rPr>
+          <w:rStyle w:val="CdigoHTML"/>
+        </w:rPr>
+        <w:t>isDayClosed</w:t>
+      </w:r>
+      <w:proofErr w:type="spellEnd"/>
+      <w:r>
+        <w:t xml:space="preserve">. </w:t>
+      </w:r>
+    </w:p>
+    <w:p>
+      <w:pPr>
+        <w:pStyle w:val="NormalWeb"/>
+        <w:numPr>
+          <w:ilvl w:val="0"/>
+          <w:numId w:val="11"/>
+        </w:numPr>
+      </w:pPr>
+      <w:r>
+        <w:rPr>
+          <w:b/>
+          <w:bCs/>
+        </w:rPr>
+        <w:t>Gestión de Compras (</w:t>
+      </w:r>
+      <w:r>
+        <w:rPr>
+          <w:rStyle w:val="CdigoHTML"/>
+          <w:b/>
+          <w:bCs/>
+        </w:rPr>
+        <w:t>compras.txt</w:t>
+      </w:r>
+      <w:r>
+        <w:rPr>
+          <w:b/>
+          <w:bCs/>
+        </w:rPr>
+        <w:t>)</w:t>
+      </w:r>
+      <w:r>
+        <w:t>:</w:t>
+      </w:r>
+    </w:p>
+    <w:p>
+      <w:pPr>
+        <w:pStyle w:val="NormalWeb"/>
+        <w:numPr>
+          <w:ilvl w:val="1"/>
+          <w:numId w:val="11"/>
+        </w:numPr>
+      </w:pPr>
+      <w:r>
+        <w:t xml:space="preserve">Carga los productos activos del inventario con </w:t>
+      </w:r>
+      <w:proofErr w:type="spellStart"/>
+      <w:r>
+        <w:rPr>
+          <w:rStyle w:val="CdigoHTML"/>
+        </w:rPr>
+        <w:t>getProducts</w:t>
+      </w:r>
+      <w:proofErr w:type="spellEnd"/>
+      <w:r>
+        <w:t xml:space="preserve"> para armar los comprobantes de compra. </w:t>
+      </w:r>
+    </w:p>
+    <w:p>
+      <w:pPr>
+        <w:pStyle w:val="NormalWeb"/>
+        <w:numPr>
+          <w:ilvl w:val="0"/>
+          <w:numId w:val="11"/>
+        </w:numPr>
+      </w:pPr>
+      <w:r>
+        <w:rPr>
+          <w:b/>
+          <w:bCs/>
+        </w:rPr>
+        <w:t>Clientes y Personal (</w:t>
+      </w:r>
+      <w:r>
+        <w:rPr>
+          <w:rStyle w:val="CdigoHTML"/>
+          <w:b/>
+          <w:bCs/>
+        </w:rPr>
+        <w:t>clientes.txt</w:t>
+      </w:r>
+      <w:r>
+        <w:rPr>
+          <w:b/>
+          <w:bCs/>
+        </w:rPr>
+        <w:t>)</w:t>
+      </w:r>
+      <w:r>
+        <w:t>:</w:t>
+      </w:r>
+    </w:p>
+    <w:p>
+      <w:pPr>
+        <w:pStyle w:val="NormalWeb"/>
+        <w:numPr>
+          <w:ilvl w:val="1"/>
+          <w:numId w:val="11"/>
+        </w:numPr>
+      </w:pPr>
+      <w:r>
+        <w:t xml:space="preserve">Administra altas, modificaciones y listados </w:t>
+      </w:r>
+      <w:proofErr w:type="spellStart"/>
+      <w:r>
+        <w:t>omnicanal</w:t>
+      </w:r>
+      <w:proofErr w:type="spellEnd"/>
+      <w:r>
+        <w:t xml:space="preserve"> consumiendo las acciones centralizadas de clientes (</w:t>
+      </w:r>
+      <w:proofErr w:type="spellStart"/>
+      <w:r>
+        <w:rPr>
+          <w:rStyle w:val="CdigoHTML"/>
+        </w:rPr>
+        <w:t>getClients</w:t>
+      </w:r>
+      <w:proofErr w:type="spellEnd"/>
+      <w:r>
+        <w:t xml:space="preserve">, </w:t>
+      </w:r>
+      <w:proofErr w:type="spellStart"/>
+      <w:r>
+        <w:rPr>
+          <w:rStyle w:val="CdigoHTML"/>
+        </w:rPr>
+        <w:t>createClient</w:t>
+      </w:r>
+      <w:proofErr w:type="spellEnd"/>
+      <w:r>
+        <w:t xml:space="preserve">, etc.). </w:t>
+      </w:r>
+    </w:p>
+    <w:p>
+      <w:pPr>
+        <w:pStyle w:val="NormalWeb"/>
+        <w:numPr>
+          <w:ilvl w:val="0"/>
+          <w:numId w:val="11"/>
+        </w:numPr>
+      </w:pPr>
+      <w:r>
+        <w:rPr>
+          <w:b/>
+          <w:bCs/>
+        </w:rPr>
+        <w:t>Portada / CMS Dinámico (</w:t>
+      </w:r>
+      <w:r>
+        <w:rPr>
+          <w:rStyle w:val="CdigoHTML"/>
+          <w:b/>
+          <w:bCs/>
+        </w:rPr>
+        <w:t>portada.txt</w:t>
+      </w:r>
+      <w:r>
+        <w:rPr>
+          <w:b/>
+          <w:bCs/>
+        </w:rPr>
+        <w:t>)</w:t>
+      </w:r>
+      <w:r>
+        <w:t>:</w:t>
+      </w:r>
+    </w:p>
+    <w:p>
+      <w:pPr>
+        <w:pStyle w:val="NormalWeb"/>
+        <w:numPr>
+          <w:ilvl w:val="1"/>
+          <w:numId w:val="11"/>
+        </w:numPr>
+      </w:pPr>
+      <w:r>
+        <w:t xml:space="preserve">Interactúa de forma directa con la API </w:t>
+      </w:r>
+      <w:r>
+        <w:rPr>
+          <w:rStyle w:val="CdigoHTML"/>
+        </w:rPr>
+        <w:t>/api/banners</w:t>
+      </w:r>
+      <w:r>
+        <w:t xml:space="preserve"> para listar, guardar y eliminar elementos visuales de la tienda web. </w:t>
+      </w:r>
+    </w:p>
+    <w:p>
+      <w:pPr>
+        <w:pStyle w:val="NormalWeb"/>
+        <w:numPr>
+          <w:ilvl w:val="0"/>
+          <w:numId w:val="11"/>
+        </w:numPr>
+      </w:pPr>
+      <w:r>
+        <w:rPr>
+          <w:b/>
+          <w:bCs/>
+        </w:rPr>
+        <w:t>Promociones (</w:t>
+      </w:r>
+      <w:r>
+        <w:rPr>
+          <w:rStyle w:val="CdigoHTML"/>
+          <w:b/>
+          <w:bCs/>
+        </w:rPr>
+        <w:t>promociones.txt</w:t>
+      </w:r>
+      <w:r>
+        <w:rPr>
+          <w:b/>
+          <w:bCs/>
+        </w:rPr>
+        <w:t>)</w:t>
+      </w:r>
+      <w:r>
+        <w:t>:</w:t>
+      </w:r>
+    </w:p>
+    <w:p>
+      <w:pPr>
+        <w:pStyle w:val="NormalWeb"/>
+        <w:numPr>
+          <w:ilvl w:val="1"/>
+          <w:numId w:val="11"/>
+        </w:numPr>
+      </w:pPr>
+      <w:r>
+        <w:t xml:space="preserve">Se alimenta dinámicamente de las rutas </w:t>
+      </w:r>
+      <w:r>
+        <w:rPr>
+          <w:rStyle w:val="CdigoHTML"/>
+        </w:rPr>
+        <w:t>/api/</w:t>
+      </w:r>
+      <w:proofErr w:type="spellStart"/>
+      <w:r>
+        <w:rPr>
+          <w:rStyle w:val="CdigoHTML"/>
+        </w:rPr>
+        <w:t>promotions</w:t>
+      </w:r>
+      <w:proofErr w:type="spellEnd"/>
+      <w:r>
+        <w:t xml:space="preserve"> y </w:t>
+      </w:r>
+      <w:r>
+        <w:rPr>
+          <w:rStyle w:val="CdigoHTML"/>
+        </w:rPr>
+        <w:t>/api/</w:t>
+      </w:r>
+      <w:proofErr w:type="spellStart"/>
+      <w:r>
+        <w:rPr>
+          <w:rStyle w:val="CdigoHTML"/>
+        </w:rPr>
+        <w:t>products</w:t>
+      </w:r>
+      <w:proofErr w:type="spellEnd"/>
+      <w:r>
+        <w:t xml:space="preserve"> para gestionar la pila de productos por categoría. </w:t>
+      </w:r>
+    </w:p>
+    <w:p>
+      <w:pPr>
+        <w:pStyle w:val="NormalWeb"/>
+        <w:numPr>
+          <w:ilvl w:val="0"/>
+          <w:numId w:val="11"/>
+        </w:numPr>
+      </w:pPr>
+      <w:r>
+        <w:rPr>
+          <w:b/>
+          <w:bCs/>
+        </w:rPr>
+        <w:t>Reseñas y Comunidad (</w:t>
+      </w:r>
+      <w:r>
+        <w:rPr>
+          <w:rStyle w:val="CdigoHTML"/>
+          <w:b/>
+          <w:bCs/>
+        </w:rPr>
+        <w:t>reseña.txt</w:t>
+      </w:r>
+      <w:r>
+        <w:rPr>
+          <w:b/>
+          <w:bCs/>
+        </w:rPr>
+        <w:t>)</w:t>
+      </w:r>
+      <w:r>
+        <w:t>:</w:t>
+      </w:r>
+    </w:p>
+    <w:p>
+      <w:pPr>
+        <w:pStyle w:val="NormalWeb"/>
+        <w:numPr>
+          <w:ilvl w:val="1"/>
+          <w:numId w:val="11"/>
+        </w:numPr>
+      </w:pPr>
+      <w:r>
+        <w:t xml:space="preserve">Conecta con </w:t>
+      </w:r>
+      <w:r>
+        <w:rPr>
+          <w:rStyle w:val="CdigoHTML"/>
+        </w:rPr>
+        <w:t>/api/</w:t>
+      </w:r>
+      <w:proofErr w:type="spellStart"/>
+      <w:r>
+        <w:rPr>
+          <w:rStyle w:val="CdigoHTML"/>
+        </w:rPr>
+        <w:t>resenas</w:t>
+      </w:r>
+      <w:proofErr w:type="spellEnd"/>
+      <w:r>
+        <w:t xml:space="preserve"> tanto para la obtención de opiniones como para la actualización mediante peticiones PATCH. </w:t>
+      </w:r>
+    </w:p>
+    <w:p>
+      <w:pPr>
+        <w:pStyle w:val="NormalWeb"/>
+        <w:numPr>
+          <w:ilvl w:val="0"/>
+          <w:numId w:val="11"/>
+        </w:numPr>
+      </w:pPr>
+      <w:r>
+        <w:rPr>
+          <w:b/>
+          <w:bCs/>
+        </w:rPr>
+        <w:t>Integración Jira / PMO (</w:t>
+      </w:r>
+      <w:r>
+        <w:rPr>
+          <w:rStyle w:val="CdigoHTML"/>
+          <w:b/>
+          <w:bCs/>
+        </w:rPr>
+        <w:t>jira.txt</w:t>
+      </w:r>
+      <w:r>
+        <w:rPr>
+          <w:b/>
+          <w:bCs/>
+        </w:rPr>
+        <w:t>)</w:t>
+      </w:r>
+      <w:r>
+        <w:t>:</w:t>
+      </w:r>
+    </w:p>
+    <w:p>
+      <w:pPr>
+        <w:pStyle w:val="NormalWeb"/>
+        <w:numPr>
+          <w:ilvl w:val="1"/>
+          <w:numId w:val="11"/>
+        </w:numPr>
+      </w:pPr>
+      <w:r>
+        <w:t xml:space="preserve">Sincroniza requerimientos, épicas e historias de usuario directamente contra la API de Jira mediante la ruta </w:t>
+      </w:r>
+      <w:r>
+        <w:rPr>
+          <w:rStyle w:val="CdigoHTML"/>
+        </w:rPr>
+        <w:t>/api/</w:t>
+      </w:r>
+      <w:proofErr w:type="spellStart"/>
+      <w:r>
+        <w:rPr>
+          <w:rStyle w:val="CdigoHTML"/>
+        </w:rPr>
+        <w:t>admin</w:t>
+      </w:r>
+      <w:proofErr w:type="spellEnd"/>
+      <w:r>
+        <w:rPr>
+          <w:rStyle w:val="CdigoHTML"/>
+        </w:rPr>
+        <w:t>/jira</w:t>
+      </w:r>
+      <w:r>
+        <w:t xml:space="preserve">. </w:t>
+      </w:r>
+    </w:p>
+    <w:p>
+      <w:pPr>
+        <w:pStyle w:val="Ttulo2"/>
+      </w:pPr>
+      <w:r>
+        <w:t xml:space="preserve">Documento Funcional: Módulo </w:t>
+      </w:r>
+      <w:proofErr w:type="spellStart"/>
+      <w:r>
+        <w:t>Dashboard</w:t>
+      </w:r>
+      <w:proofErr w:type="spellEnd"/>
+      <w:r>
+        <w:t xml:space="preserve"> Admin &amp; Operaciones</w:t>
+      </w:r>
+    </w:p>
+    <w:p>
+      <w:pPr>
+        <w:pStyle w:val="NormalWeb"/>
+      </w:pPr>
+      <w:r>
+        <w:t>A continuación, presento el documento funcional estructurado del sistema administrativo, integrando el análisis de los módulos operativos y detallando el estado actual del módulo de reportes.</w:t>
+      </w:r>
+    </w:p>
+    <w:p>
+      <w:pPr>
+        <w:pStyle w:val="Ttulo3"/>
+      </w:pPr>
+      <w:r>
+        <w:t>1. Propósito del Sistema</w:t>
+      </w:r>
+    </w:p>
+    <w:p>
+      <w:pPr>
+        <w:pStyle w:val="NormalWeb"/>
+      </w:pPr>
+      <w:r>
+        <w:t xml:space="preserve">El </w:t>
+      </w:r>
+      <w:proofErr w:type="spellStart"/>
+      <w:r>
+        <w:t>Dashboard</w:t>
+      </w:r>
+      <w:proofErr w:type="spellEnd"/>
+      <w:r>
+        <w:t xml:space="preserve"> Administrativo de </w:t>
+      </w:r>
+      <w:r>
+        <w:rPr>
+          <w:i/>
+          <w:iCs/>
+        </w:rPr>
+        <w:t>Tienda de Plantas</w:t>
+      </w:r>
+      <w:r>
+        <w:t xml:space="preserve"> centraliza de forma unificada la operación comercial diaria, el control de inventario, la logística de entregas, el arqueo de caja, la gestión de contenidos web (CMS) y el seguimiento de tareas del proyecto.</w:t>
+      </w:r>
+    </w:p>
+    <w:p>
+      <w:pPr>
+        <w:pStyle w:val="Ttulo3"/>
+      </w:pPr>
+      <w:r>
+        <w:lastRenderedPageBreak/>
+        <w:t>2. Arquitectura de Módulos Operativos</w:t>
+      </w:r>
+    </w:p>
+    <w:p>
+      <w:pPr>
+        <w:pStyle w:val="NormalWeb"/>
+        <w:numPr>
+          <w:ilvl w:val="0"/>
+          <w:numId w:val="12"/>
+        </w:numPr>
+      </w:pPr>
+      <w:r>
+        <w:rPr>
+          <w:b/>
+          <w:bCs/>
+        </w:rPr>
+        <w:t>Gestión de Catálogo e Inventario</w:t>
+      </w:r>
+      <w:r>
+        <w:t xml:space="preserve">: Control integral de especies, cálculo automático de costos y precios finales con IVA, y soporte para importación masiva. </w:t>
+      </w:r>
+    </w:p>
+    <w:p>
+      <w:pPr>
+        <w:pStyle w:val="NormalWeb"/>
+        <w:numPr>
+          <w:ilvl w:val="0"/>
+          <w:numId w:val="12"/>
+        </w:numPr>
+      </w:pPr>
+      <w:r>
+        <w:rPr>
+          <w:b/>
+          <w:bCs/>
+        </w:rPr>
+        <w:t>Punto de Venta (POS) y Mostrador</w:t>
+      </w:r>
+      <w:r>
+        <w:t xml:space="preserve">: Terminal de ventas rápida, control de saldos y cuentas corrientes, y autocompletado logístico para envíos. </w:t>
+      </w:r>
+    </w:p>
+    <w:p>
+      <w:pPr>
+        <w:pStyle w:val="NormalWeb"/>
+        <w:numPr>
+          <w:ilvl w:val="0"/>
+          <w:numId w:val="12"/>
+        </w:numPr>
+      </w:pPr>
+      <w:r>
+        <w:rPr>
+          <w:b/>
+          <w:bCs/>
+        </w:rPr>
+        <w:t>Caja Diaria</w:t>
+      </w:r>
+      <w:r>
+        <w:t xml:space="preserve">: Registro de ingresos y egresos manuales, desglose por medios de pago (efectivo, transferencias, tarjetas, </w:t>
+      </w:r>
+      <w:proofErr w:type="spellStart"/>
+      <w:r>
+        <w:t>MercadoPago</w:t>
+      </w:r>
+      <w:proofErr w:type="spellEnd"/>
+      <w:r>
+        <w:t xml:space="preserve">) y cierre formal con bloqueo diario. </w:t>
+      </w:r>
+    </w:p>
+    <w:p>
+      <w:pPr>
+        <w:pStyle w:val="NormalWeb"/>
+        <w:numPr>
+          <w:ilvl w:val="0"/>
+          <w:numId w:val="12"/>
+        </w:numPr>
+      </w:pPr>
+      <w:r>
+        <w:rPr>
+          <w:b/>
+          <w:bCs/>
+        </w:rPr>
+        <w:t>CMS de Portada y Promociones</w:t>
+      </w:r>
+      <w:r>
+        <w:t xml:space="preserve">: Administración visual de banners por sección y armado de ofertas con selección dinámica de productos. </w:t>
+      </w:r>
+    </w:p>
+    <w:p>
+      <w:pPr>
+        <w:pStyle w:val="NormalWeb"/>
+        <w:numPr>
+          <w:ilvl w:val="0"/>
+          <w:numId w:val="12"/>
+        </w:numPr>
+      </w:pPr>
+      <w:r>
+        <w:rPr>
+          <w:b/>
+          <w:bCs/>
+        </w:rPr>
+        <w:t>CRM y Comunidad</w:t>
+      </w:r>
+      <w:r>
+        <w:t xml:space="preserve">: Directorio unificado de clientes y personal con perfiles de acceso diferenciados y panel de moderación de reseñas. </w:t>
+      </w:r>
+    </w:p>
+    <w:p>
+      <w:pPr>
+        <w:pStyle w:val="NormalWeb"/>
+        <w:numPr>
+          <w:ilvl w:val="0"/>
+          <w:numId w:val="12"/>
+        </w:numPr>
+      </w:pPr>
+      <w:r>
+        <w:rPr>
+          <w:b/>
+          <w:bCs/>
+        </w:rPr>
+        <w:t>Gestión PMO (Jira)</w:t>
+      </w:r>
+      <w:r>
+        <w:t xml:space="preserve">: Sincronización ágil de requerimientos técnicos e historias de usuario. </w:t>
+      </w:r>
+    </w:p>
+    <w:p>
+      <w:pPr>
+        <w:pStyle w:val="Ttulo3"/>
+      </w:pPr>
+      <w:r>
+        <w:t>3. Estado del Módulo de Reportes</w:t>
+      </w:r>
+    </w:p>
+    <w:p>
+      <w:pPr>
+        <w:pStyle w:val="NormalWeb"/>
+        <w:numPr>
+          <w:ilvl w:val="0"/>
+          <w:numId w:val="13"/>
+        </w:numPr>
+      </w:pPr>
+      <w:r>
+        <w:t>Actualmente se encuentra contemplado en la estructura general con una vista preliminar de interfaz.</w:t>
+      </w:r>
+    </w:p>
+    <w:p>
+      <w:pPr>
+        <w:pStyle w:val="NormalWeb"/>
+        <w:numPr>
+          <w:ilvl w:val="0"/>
+          <w:numId w:val="13"/>
+        </w:numPr>
+      </w:pPr>
+      <w:r>
+        <w:rPr>
+          <w:i/>
+          <w:iCs/>
+        </w:rPr>
+        <w:t>Siguiente paso técnico</w:t>
+      </w:r>
+      <w:r>
+        <w:t>: Vincular las vistas de reportes con las bases de datos de ventas e inventario mediante consultas agregadas para ofrecer analíticas de rendimiento comercial y exportación de datos.</w:t>
+      </w:r>
+    </w:p>
+    <w:p>
+      <w:pPr>
+        <w:pStyle w:val="NormalWeb"/>
+      </w:pPr>
+      <w:r>
+        <w:t>Excelente. He realizado el análisis técnico detallado de todos los archivos adjuntos (</w:t>
+      </w:r>
+      <w:r>
+        <w:rPr>
+          <w:rStyle w:val="CdigoHTML"/>
+        </w:rPr>
+        <w:t>reportes.txt</w:t>
+      </w:r>
+      <w:r>
+        <w:t xml:space="preserve">, </w:t>
+      </w:r>
+      <w:r>
+        <w:rPr>
+          <w:rStyle w:val="CdigoHTML"/>
+        </w:rPr>
+        <w:t>api_reportes_route.txt</w:t>
+      </w:r>
+      <w:r>
+        <w:t xml:space="preserve">, </w:t>
+      </w:r>
+      <w:r>
+        <w:rPr>
+          <w:rStyle w:val="CdigoHTML"/>
+        </w:rPr>
+        <w:t>admin_dashboard.txt</w:t>
+      </w:r>
+      <w:r>
+        <w:t xml:space="preserve">, </w:t>
+      </w:r>
+      <w:r>
+        <w:rPr>
+          <w:rStyle w:val="CdigoHTML"/>
+        </w:rPr>
+        <w:t>admin_layout.txt</w:t>
+      </w:r>
+      <w:r>
+        <w:t xml:space="preserve"> y </w:t>
+      </w:r>
+      <w:r>
+        <w:rPr>
+          <w:rStyle w:val="CdigoHTML"/>
+        </w:rPr>
+        <w:t>schema_prisma.txt</w:t>
+      </w:r>
+      <w:r>
+        <w:t>).</w:t>
+      </w:r>
+    </w:p>
+    <w:p>
+      <w:pPr>
+        <w:pStyle w:val="NormalWeb"/>
+      </w:pPr>
+      <w:r>
+        <w:t xml:space="preserve">Con estos componentes, el </w:t>
+      </w:r>
+      <w:r>
+        <w:rPr>
+          <w:b/>
+          <w:bCs/>
+        </w:rPr>
+        <w:t>Centro de Reportes</w:t>
+      </w:r>
+      <w:r>
+        <w:t xml:space="preserve"> y su integración completa con el </w:t>
+      </w:r>
+      <w:proofErr w:type="spellStart"/>
+      <w:r>
+        <w:t>backend</w:t>
+      </w:r>
+      <w:proofErr w:type="spellEnd"/>
+      <w:r>
+        <w:t xml:space="preserve"> de </w:t>
+      </w:r>
+      <w:proofErr w:type="spellStart"/>
+      <w:r>
+        <w:t>TiDB</w:t>
+      </w:r>
+      <w:proofErr w:type="spellEnd"/>
+      <w:r>
+        <w:t xml:space="preserve"> a través de Prisma quedan perfectamente estructurados y sincronizados con el resto del ERP/CRM.</w:t>
+      </w:r>
+    </w:p>
+    <w:p>
+      <w:pPr>
+        <w:pStyle w:val="Ttulo3"/>
+      </w:pPr>
+      <w:r>
+        <w:t>Análisis de los Módulos y su Integración</w:t>
+      </w:r>
+    </w:p>
+    <w:p>
+      <w:pPr>
+        <w:pStyle w:val="NormalWeb"/>
+        <w:numPr>
+          <w:ilvl w:val="0"/>
+          <w:numId w:val="14"/>
+        </w:numPr>
+      </w:pPr>
+      <w:proofErr w:type="spellStart"/>
+      <w:r>
+        <w:rPr>
+          <w:b/>
+          <w:bCs/>
+        </w:rPr>
+        <w:t>Frontend</w:t>
+      </w:r>
+      <w:proofErr w:type="spellEnd"/>
+      <w:r>
+        <w:rPr>
+          <w:b/>
+          <w:bCs/>
+        </w:rPr>
+        <w:t xml:space="preserve"> del Centro de Reportes (</w:t>
+      </w:r>
+      <w:r>
+        <w:rPr>
+          <w:rStyle w:val="CdigoHTML"/>
+          <w:b/>
+          <w:bCs/>
+        </w:rPr>
+        <w:t>reportes.txt</w:t>
+      </w:r>
+      <w:r>
+        <w:rPr>
+          <w:b/>
+          <w:bCs/>
+        </w:rPr>
+        <w:t>)</w:t>
+      </w:r>
+      <w:r>
+        <w:t>:</w:t>
+      </w:r>
+    </w:p>
+    <w:p>
+      <w:pPr>
+        <w:pStyle w:val="NormalWeb"/>
+        <w:numPr>
+          <w:ilvl w:val="1"/>
+          <w:numId w:val="14"/>
+        </w:numPr>
+      </w:pPr>
+      <w:r>
+        <w:t xml:space="preserve">Permite alternar dinámicamente entre tres grandes áreas: </w:t>
+      </w:r>
+      <w:r>
+        <w:rPr>
+          <w:b/>
+          <w:bCs/>
+        </w:rPr>
+        <w:t>ERP</w:t>
+      </w:r>
+      <w:r>
+        <w:t xml:space="preserve">, </w:t>
+      </w:r>
+      <w:r>
+        <w:rPr>
+          <w:b/>
+          <w:bCs/>
+        </w:rPr>
+        <w:t>CRM</w:t>
+      </w:r>
+      <w:r>
+        <w:t xml:space="preserve"> y </w:t>
+      </w:r>
+      <w:r>
+        <w:rPr>
+          <w:b/>
+          <w:bCs/>
+        </w:rPr>
+        <w:t>WEB</w:t>
+      </w:r>
+      <w:r>
+        <w:t xml:space="preserve">. </w:t>
+      </w:r>
+    </w:p>
+    <w:p>
+      <w:pPr>
+        <w:pStyle w:val="NormalWeb"/>
+        <w:numPr>
+          <w:ilvl w:val="1"/>
+          <w:numId w:val="14"/>
+        </w:numPr>
+      </w:pPr>
+      <w:r>
+        <w:t xml:space="preserve">Cuenta con selectores de filtros temporales (fechas "desde" y "hasta"), botones de actualización en tiempo real, modo de impresión/PDF y vista de pantalla completa. </w:t>
+      </w:r>
+    </w:p>
+    <w:p>
+      <w:pPr>
+        <w:pStyle w:val="NormalWeb"/>
+        <w:numPr>
+          <w:ilvl w:val="1"/>
+          <w:numId w:val="14"/>
+        </w:numPr>
+      </w:pPr>
+      <w:proofErr w:type="spellStart"/>
+      <w:r>
+        <w:t>Renderiza</w:t>
+      </w:r>
+      <w:proofErr w:type="spellEnd"/>
+      <w:r>
+        <w:t xml:space="preserve"> de forma inteligente dos tipos de visualizaciones: gráficos de barras verticales para evolución temporal y rankings horizontales con porcentajes y montos para desglose de categorías o clientes. </w:t>
+      </w:r>
+    </w:p>
+    <w:p>
+      <w:pPr>
+        <w:pStyle w:val="NormalWeb"/>
+        <w:numPr>
+          <w:ilvl w:val="0"/>
+          <w:numId w:val="14"/>
+        </w:numPr>
+      </w:pPr>
+      <w:proofErr w:type="spellStart"/>
+      <w:r>
+        <w:rPr>
+          <w:b/>
+          <w:bCs/>
+        </w:rPr>
+        <w:t>Backend</w:t>
+      </w:r>
+      <w:proofErr w:type="spellEnd"/>
+      <w:r>
+        <w:rPr>
+          <w:b/>
+          <w:bCs/>
+        </w:rPr>
+        <w:t xml:space="preserve"> API de Reportes (</w:t>
+      </w:r>
+      <w:r>
+        <w:rPr>
+          <w:rStyle w:val="CdigoHTML"/>
+          <w:b/>
+          <w:bCs/>
+        </w:rPr>
+        <w:t>api_reportes_route.txt</w:t>
+      </w:r>
+      <w:r>
+        <w:rPr>
+          <w:b/>
+          <w:bCs/>
+        </w:rPr>
+        <w:t>)</w:t>
+      </w:r>
+      <w:r>
+        <w:t>:</w:t>
+      </w:r>
+    </w:p>
+    <w:p>
+      <w:pPr>
+        <w:pStyle w:val="NormalWeb"/>
+        <w:numPr>
+          <w:ilvl w:val="1"/>
+          <w:numId w:val="14"/>
+        </w:numPr>
+      </w:pPr>
+      <w:r>
+        <w:t xml:space="preserve">Procesa las peticiones GET interpretando los parámetros de módulo, tipo y rangos de fecha definidos en el </w:t>
+      </w:r>
+      <w:proofErr w:type="spellStart"/>
+      <w:r>
+        <w:t>frontend</w:t>
+      </w:r>
+      <w:proofErr w:type="spellEnd"/>
+      <w:r>
+        <w:t xml:space="preserve">. </w:t>
+      </w:r>
+    </w:p>
+    <w:p>
+      <w:pPr>
+        <w:pStyle w:val="NormalWeb"/>
+        <w:numPr>
+          <w:ilvl w:val="1"/>
+          <w:numId w:val="14"/>
+        </w:numPr>
+      </w:pPr>
+      <w:r>
+        <w:t xml:space="preserve">Para el </w:t>
+      </w:r>
+      <w:r>
+        <w:rPr>
+          <w:b/>
+          <w:bCs/>
+        </w:rPr>
+        <w:t>módulo ERP</w:t>
+      </w:r>
+      <w:r>
+        <w:t xml:space="preserve">, calcula facturación total, transacciones, ticket promedio, estados de cuentas corrientes, valorización de inventario y control de stock bajo. </w:t>
+      </w:r>
+    </w:p>
+    <w:p>
+      <w:pPr>
+        <w:pStyle w:val="NormalWeb"/>
+        <w:numPr>
+          <w:ilvl w:val="1"/>
+          <w:numId w:val="14"/>
+        </w:numPr>
+      </w:pPr>
+      <w:r>
+        <w:lastRenderedPageBreak/>
+        <w:t xml:space="preserve">Para el </w:t>
+      </w:r>
+      <w:r>
+        <w:rPr>
+          <w:b/>
+          <w:bCs/>
+        </w:rPr>
+        <w:t>módulo CRM</w:t>
+      </w:r>
+      <w:r>
+        <w:t>, agrupa las compras por cliente (</w:t>
+      </w:r>
+      <w:proofErr w:type="spellStart"/>
+      <w:r>
+        <w:rPr>
+          <w:rStyle w:val="CdigoHTML"/>
+        </w:rPr>
+        <w:t>Customer</w:t>
+      </w:r>
+      <w:proofErr w:type="spellEnd"/>
+      <w:r>
+        <w:t xml:space="preserve">), calcula el volumen total de transacciones y genera un ranking ordenado de los mejores compradores. </w:t>
+      </w:r>
+    </w:p>
+    <w:p>
+      <w:pPr>
+        <w:pStyle w:val="NormalWeb"/>
+        <w:numPr>
+          <w:ilvl w:val="1"/>
+          <w:numId w:val="14"/>
+        </w:numPr>
+      </w:pPr>
+      <w:r>
+        <w:t xml:space="preserve">Maneja de forma robusta los casos en los que no existan registros en el rango de fechas consultado, devolviendo una estructura limpia sin romper la interfaz. </w:t>
+      </w:r>
+    </w:p>
+    <w:p>
+      <w:pPr>
+        <w:pStyle w:val="NormalWeb"/>
+        <w:numPr>
+          <w:ilvl w:val="0"/>
+          <w:numId w:val="14"/>
+        </w:numPr>
+      </w:pPr>
+      <w:proofErr w:type="spellStart"/>
+      <w:r>
+        <w:rPr>
+          <w:b/>
+          <w:bCs/>
+        </w:rPr>
+        <w:t>Dashboard</w:t>
+      </w:r>
+      <w:proofErr w:type="spellEnd"/>
+      <w:r>
+        <w:rPr>
+          <w:b/>
+          <w:bCs/>
+        </w:rPr>
+        <w:t xml:space="preserve"> Principal y </w:t>
+      </w:r>
+      <w:proofErr w:type="spellStart"/>
+      <w:r>
+        <w:rPr>
+          <w:b/>
+          <w:bCs/>
+        </w:rPr>
+        <w:t>Layout</w:t>
+      </w:r>
+      <w:proofErr w:type="spellEnd"/>
+      <w:r>
+        <w:rPr>
+          <w:b/>
+          <w:bCs/>
+        </w:rPr>
+        <w:t xml:space="preserve"> (</w:t>
+      </w:r>
+      <w:r>
+        <w:rPr>
+          <w:rStyle w:val="CdigoHTML"/>
+          <w:b/>
+          <w:bCs/>
+        </w:rPr>
+        <w:t>admin_dashboard.txt</w:t>
+      </w:r>
+      <w:r>
+        <w:rPr>
+          <w:b/>
+          <w:bCs/>
+        </w:rPr>
+        <w:t xml:space="preserve"> y </w:t>
+      </w:r>
+      <w:r>
+        <w:rPr>
+          <w:rStyle w:val="CdigoHTML"/>
+          <w:b/>
+          <w:bCs/>
+        </w:rPr>
+        <w:t>admin_layout.txt</w:t>
+      </w:r>
+      <w:r>
+        <w:rPr>
+          <w:b/>
+          <w:bCs/>
+        </w:rPr>
+        <w:t>)</w:t>
+      </w:r>
+      <w:r>
+        <w:t>:</w:t>
+      </w:r>
+    </w:p>
+    <w:p>
+      <w:pPr>
+        <w:pStyle w:val="NormalWeb"/>
+        <w:numPr>
+          <w:ilvl w:val="1"/>
+          <w:numId w:val="14"/>
+        </w:numPr>
+      </w:pPr>
+      <w:r>
+        <w:t>El panel de control centraliza los accesos directos aplicando restricciones por roles (</w:t>
+      </w:r>
+      <w:r>
+        <w:rPr>
+          <w:b/>
+          <w:bCs/>
+        </w:rPr>
+        <w:t>RBAC</w:t>
+      </w:r>
+      <w:r>
+        <w:t xml:space="preserve">) y muestra contadores reales de facturas y pedidos obtenidos desde la base de datos. </w:t>
+      </w:r>
+    </w:p>
+    <w:p>
+      <w:pPr>
+        <w:pStyle w:val="NormalWeb"/>
+        <w:numPr>
+          <w:ilvl w:val="1"/>
+          <w:numId w:val="14"/>
+        </w:numPr>
+      </w:pPr>
+      <w:r>
+        <w:t xml:space="preserve">El </w:t>
+      </w:r>
+      <w:proofErr w:type="spellStart"/>
+      <w:r>
+        <w:t>layout</w:t>
+      </w:r>
+      <w:proofErr w:type="spellEnd"/>
+      <w:r>
+        <w:t xml:space="preserve"> global integra autenticación mediante </w:t>
+      </w:r>
+      <w:proofErr w:type="spellStart"/>
+      <w:r>
+        <w:t>NextAuth</w:t>
+      </w:r>
+      <w:proofErr w:type="spellEnd"/>
+      <w:r>
+        <w:t xml:space="preserve"> (</w:t>
+      </w:r>
+      <w:proofErr w:type="spellStart"/>
+      <w:r>
+        <w:rPr>
+          <w:rStyle w:val="CdigoHTML"/>
+        </w:rPr>
+        <w:t>SessionProvider</w:t>
+      </w:r>
+      <w:proofErr w:type="spellEnd"/>
+      <w:r>
+        <w:t xml:space="preserve">), cabecera responsiva con fecha formateada en español, y enlaces directos tanto al panel de administración como a la tienda pública. </w:t>
+      </w:r>
+    </w:p>
+    <w:p>
+      <w:pPr>
+        <w:pStyle w:val="NormalWeb"/>
+        <w:numPr>
+          <w:ilvl w:val="0"/>
+          <w:numId w:val="14"/>
+        </w:numPr>
+      </w:pPr>
+      <w:r>
+        <w:rPr>
+          <w:b/>
+          <w:bCs/>
+        </w:rPr>
+        <w:t>Esquema de Base de Datos (</w:t>
+      </w:r>
+      <w:r>
+        <w:rPr>
+          <w:rStyle w:val="CdigoHTML"/>
+          <w:b/>
+          <w:bCs/>
+        </w:rPr>
+        <w:t>schema_prisma.txt</w:t>
+      </w:r>
+      <w:r>
+        <w:rPr>
+          <w:b/>
+          <w:bCs/>
+        </w:rPr>
+        <w:t>)</w:t>
+      </w:r>
+      <w:r>
+        <w:t>:</w:t>
+      </w:r>
+    </w:p>
+    <w:p>
+      <w:pPr>
+        <w:pStyle w:val="NormalWeb"/>
+        <w:numPr>
+          <w:ilvl w:val="1"/>
+          <w:numId w:val="14"/>
+        </w:numPr>
+      </w:pPr>
+      <w:r>
+        <w:t xml:space="preserve">Proporciona el soporte relacional necesario mediante modelos clave como </w:t>
+      </w:r>
+      <w:r>
+        <w:rPr>
+          <w:rStyle w:val="CdigoHTML"/>
+        </w:rPr>
+        <w:t>Sale</w:t>
+      </w:r>
+      <w:r>
+        <w:t xml:space="preserve">, </w:t>
+      </w:r>
+      <w:proofErr w:type="spellStart"/>
+      <w:r>
+        <w:rPr>
+          <w:rStyle w:val="CdigoHTML"/>
+        </w:rPr>
+        <w:t>SaleItem</w:t>
+      </w:r>
+      <w:proofErr w:type="spellEnd"/>
+      <w:r>
+        <w:t xml:space="preserve">, </w:t>
+      </w:r>
+      <w:proofErr w:type="spellStart"/>
+      <w:r>
+        <w:rPr>
+          <w:rStyle w:val="CdigoHTML"/>
+        </w:rPr>
+        <w:t>Product</w:t>
+      </w:r>
+      <w:proofErr w:type="spellEnd"/>
+      <w:r>
+        <w:t xml:space="preserve">, </w:t>
+      </w:r>
+      <w:proofErr w:type="spellStart"/>
+      <w:r>
+        <w:rPr>
+          <w:rStyle w:val="CdigoHTML"/>
+        </w:rPr>
+        <w:t>Customer</w:t>
+      </w:r>
+      <w:proofErr w:type="spellEnd"/>
+      <w:r>
+        <w:t xml:space="preserve">, </w:t>
+      </w:r>
+      <w:proofErr w:type="spellStart"/>
+      <w:r>
+        <w:rPr>
+          <w:rStyle w:val="CdigoHTML"/>
+        </w:rPr>
+        <w:t>Promotion</w:t>
+      </w:r>
+      <w:proofErr w:type="spellEnd"/>
+      <w:r>
+        <w:t xml:space="preserve">, </w:t>
+      </w:r>
+      <w:proofErr w:type="spellStart"/>
+      <w:r>
+        <w:rPr>
+          <w:rStyle w:val="CdigoHTML"/>
+        </w:rPr>
+        <w:t>CashClosure</w:t>
+      </w:r>
+      <w:proofErr w:type="spellEnd"/>
+      <w:r>
+        <w:t xml:space="preserve"> y </w:t>
+      </w:r>
+      <w:proofErr w:type="spellStart"/>
+      <w:r>
+        <w:rPr>
+          <w:rStyle w:val="CdigoHTML"/>
+        </w:rPr>
+        <w:t>CompanySettings</w:t>
+      </w:r>
+      <w:proofErr w:type="spellEnd"/>
+      <w:r>
+        <w:t xml:space="preserve">, asegurando la integridad de los datos financieros y de inventario. </w:t>
+      </w:r>
+    </w:p>
+    <w:p>
       <w:bookmarkStart w:id="0" w:name="_GoBack"/>
       <w:bookmarkEnd w:id="0"/>
     </w:p>
-    <w:p/>
     <w:sectPr>
       <w:pgSz w:w="11906" w:h="16838"/>
       <w:pgMar w:top="1417" w:right="1701" w:bottom="1417" w:left="1701" w:header="708" w:footer="708" w:gutter="0"/>
@@ -2885,6 +4442,155 @@
 <file path=word/numbering.xml><?xml version="1.0" encoding="utf-8"?>
 <w:numbering xmlns:wpc="http://schemas.microsoft.com/office/word/2010/wordprocessingCanvas" xmlns:mc="http://schemas.openxmlformats.org/markup-compatibility/2006" xmlns:o="urn:schemas-microsoft-com:office:office" xmlns:r="http://schemas.openxmlformats.org/officeDocument/2006/relationships" xmlns:m="http://schemas.openxmlformats.org/officeDocument/2006/math" xmlns:v="urn:schemas-microsoft-com:vml" xmlns:wp14="http://schemas.microsoft.com/office/word/2010/wordprocessingDrawing" xmlns:wp="http://schemas.openxmlformats.org/drawingml/2006/wordprocessingDrawing" xmlns:w10="urn:schemas-microsoft-com:office:word" xmlns:w="http://schemas.openxmlformats.org/wordprocessingml/2006/main" xmlns:w14="http://schemas.microsoft.com/office/word/2010/wordml" xmlns:wpg="http://schemas.microsoft.com/office/word/2010/wordprocessingGroup" xmlns:wpi="http://schemas.microsoft.com/office/word/2010/wordprocessingInk" xmlns:wne="http://schemas.microsoft.com/office/word/2006/wordml" xmlns:wps="http://schemas.microsoft.com/office/word/2010/wordprocessingShape" mc:Ignorable="w14 wp14">
   <w:abstractNum w:abstractNumId="0">
+    <w:nsid w:val="010B3683"/>
+    <w:multiLevelType w:val="multilevel"/>
+    <w:tmpl w:val="F89653D6"/>
+    <w:lvl w:ilvl="0">
+      <w:start w:val="1"/>
+      <w:numFmt w:val="bullet"/>
+      <w:lvlText w:val=""/>
+      <w:lvlJc w:val="left"/>
+      <w:pPr>
+        <w:tabs>
+          <w:tab w:val="num" w:pos="720"/>
+        </w:tabs>
+        <w:ind w:left="720" w:hanging="360"/>
+      </w:pPr>
+      <w:rPr>
+        <w:rFonts w:ascii="Symbol" w:hAnsi="Symbol" w:hint="default"/>
+        <w:sz w:val="20"/>
+      </w:rPr>
+    </w:lvl>
+    <w:lvl w:ilvl="1" w:tentative="1">
+      <w:start w:val="1"/>
+      <w:numFmt w:val="bullet"/>
+      <w:lvlText w:val="o"/>
+      <w:lvlJc w:val="left"/>
+      <w:pPr>
+        <w:tabs>
+          <w:tab w:val="num" w:pos="1440"/>
+        </w:tabs>
+        <w:ind w:left="1440" w:hanging="360"/>
+      </w:pPr>
+      <w:rPr>
+        <w:rFonts w:ascii="Courier New" w:hAnsi="Courier New" w:hint="default"/>
+        <w:sz w:val="20"/>
+      </w:rPr>
+    </w:lvl>
+    <w:lvl w:ilvl="2" w:tentative="1">
+      <w:start w:val="1"/>
+      <w:numFmt w:val="bullet"/>
+      <w:lvlText w:val=""/>
+      <w:lvlJc w:val="left"/>
+      <w:pPr>
+        <w:tabs>
+          <w:tab w:val="num" w:pos="2160"/>
+        </w:tabs>
+        <w:ind w:left="2160" w:hanging="360"/>
+      </w:pPr>
+      <w:rPr>
+        <w:rFonts w:ascii="Wingdings" w:hAnsi="Wingdings" w:hint="default"/>
+        <w:sz w:val="20"/>
+      </w:rPr>
+    </w:lvl>
+    <w:lvl w:ilvl="3" w:tentative="1">
+      <w:start w:val="1"/>
+      <w:numFmt w:val="bullet"/>
+      <w:lvlText w:val=""/>
+      <w:lvlJc w:val="left"/>
+      <w:pPr>
+        <w:tabs>
+          <w:tab w:val="num" w:pos="2880"/>
+        </w:tabs>
+        <w:ind w:left="2880" w:hanging="360"/>
+      </w:pPr>
+      <w:rPr>
+        <w:rFonts w:ascii="Wingdings" w:hAnsi="Wingdings" w:hint="default"/>
+        <w:sz w:val="20"/>
+      </w:rPr>
+    </w:lvl>
+    <w:lvl w:ilvl="4" w:tentative="1">
+      <w:start w:val="1"/>
+      <w:numFmt w:val="bullet"/>
+      <w:lvlText w:val=""/>
+      <w:lvlJc w:val="left"/>
+      <w:pPr>
+        <w:tabs>
+          <w:tab w:val="num" w:pos="3600"/>
+        </w:tabs>
+        <w:ind w:left="3600" w:hanging="360"/>
+      </w:pPr>
+      <w:rPr>
+        <w:rFonts w:ascii="Wingdings" w:hAnsi="Wingdings" w:hint="default"/>
+        <w:sz w:val="20"/>
+      </w:rPr>
+    </w:lvl>
+    <w:lvl w:ilvl="5" w:tentative="1">
+      <w:start w:val="1"/>
+      <w:numFmt w:val="bullet"/>
+      <w:lvlText w:val=""/>
+      <w:lvlJc w:val="left"/>
+      <w:pPr>
+        <w:tabs>
+          <w:tab w:val="num" w:pos="4320"/>
+        </w:tabs>
+        <w:ind w:left="4320" w:hanging="360"/>
+      </w:pPr>
+      <w:rPr>
+        <w:rFonts w:ascii="Wingdings" w:hAnsi="Wingdings" w:hint="default"/>
+        <w:sz w:val="20"/>
+      </w:rPr>
+    </w:lvl>
+    <w:lvl w:ilvl="6" w:tentative="1">
+      <w:start w:val="1"/>
+      <w:numFmt w:val="bullet"/>
+      <w:lvlText w:val=""/>
+      <w:lvlJc w:val="left"/>
+      <w:pPr>
+        <w:tabs>
+          <w:tab w:val="num" w:pos="5040"/>
+        </w:tabs>
+        <w:ind w:left="5040" w:hanging="360"/>
+      </w:pPr>
+      <w:rPr>
+        <w:rFonts w:ascii="Wingdings" w:hAnsi="Wingdings" w:hint="default"/>
+        <w:sz w:val="20"/>
+      </w:rPr>
+    </w:lvl>
+    <w:lvl w:ilvl="7" w:tentative="1">
+      <w:start w:val="1"/>
+      <w:numFmt w:val="bullet"/>
+      <w:lvlText w:val=""/>
+      <w:lvlJc w:val="left"/>
+      <w:pPr>
+        <w:tabs>
+          <w:tab w:val="num" w:pos="5760"/>
+        </w:tabs>
+        <w:ind w:left="5760" w:hanging="360"/>
+      </w:pPr>
+      <w:rPr>
+        <w:rFonts w:ascii="Wingdings" w:hAnsi="Wingdings" w:hint="default"/>
+        <w:sz w:val="20"/>
+      </w:rPr>
+    </w:lvl>
+    <w:lvl w:ilvl="8" w:tentative="1">
+      <w:start w:val="1"/>
+      <w:numFmt w:val="bullet"/>
+      <w:lvlText w:val=""/>
+      <w:lvlJc w:val="left"/>
+      <w:pPr>
+        <w:tabs>
+          <w:tab w:val="num" w:pos="6480"/>
+        </w:tabs>
+        <w:ind w:left="6480" w:hanging="360"/>
+      </w:pPr>
+      <w:rPr>
+        <w:rFonts w:ascii="Wingdings" w:hAnsi="Wingdings" w:hint="default"/>
+        <w:sz w:val="20"/>
+      </w:rPr>
+    </w:lvl>
+  </w:abstractNum>
+  <w:abstractNum w:abstractNumId="1">
     <w:nsid w:val="0B6A2607"/>
     <w:multiLevelType w:val="multilevel"/>
     <w:tmpl w:val="08B42A78"/>
@@ -3033,7 +4739,273 @@
       </w:rPr>
     </w:lvl>
   </w:abstractNum>
-  <w:abstractNum w:abstractNumId="1">
+  <w:abstractNum w:abstractNumId="2">
+    <w:nsid w:val="1A7F3DFB"/>
+    <w:multiLevelType w:val="multilevel"/>
+    <w:tmpl w:val="EB7806F0"/>
+    <w:lvl w:ilvl="0">
+      <w:start w:val="1"/>
+      <w:numFmt w:val="bullet"/>
+      <w:lvlText w:val=""/>
+      <w:lvlJc w:val="left"/>
+      <w:pPr>
+        <w:tabs>
+          <w:tab w:val="num" w:pos="720"/>
+        </w:tabs>
+        <w:ind w:left="720" w:hanging="360"/>
+      </w:pPr>
+      <w:rPr>
+        <w:rFonts w:ascii="Symbol" w:hAnsi="Symbol" w:hint="default"/>
+        <w:sz w:val="20"/>
+      </w:rPr>
+    </w:lvl>
+    <w:lvl w:ilvl="1">
+      <w:start w:val="1"/>
+      <w:numFmt w:val="bullet"/>
+      <w:lvlText w:val="o"/>
+      <w:lvlJc w:val="left"/>
+      <w:pPr>
+        <w:tabs>
+          <w:tab w:val="num" w:pos="1440"/>
+        </w:tabs>
+        <w:ind w:left="1440" w:hanging="360"/>
+      </w:pPr>
+      <w:rPr>
+        <w:rFonts w:ascii="Courier New" w:hAnsi="Courier New" w:hint="default"/>
+        <w:sz w:val="20"/>
+      </w:rPr>
+    </w:lvl>
+    <w:lvl w:ilvl="2" w:tentative="1">
+      <w:start w:val="1"/>
+      <w:numFmt w:val="bullet"/>
+      <w:lvlText w:val=""/>
+      <w:lvlJc w:val="left"/>
+      <w:pPr>
+        <w:tabs>
+          <w:tab w:val="num" w:pos="2160"/>
+        </w:tabs>
+        <w:ind w:left="2160" w:hanging="360"/>
+      </w:pPr>
+      <w:rPr>
+        <w:rFonts w:ascii="Wingdings" w:hAnsi="Wingdings" w:hint="default"/>
+        <w:sz w:val="20"/>
+      </w:rPr>
+    </w:lvl>
+    <w:lvl w:ilvl="3" w:tentative="1">
+      <w:start w:val="1"/>
+      <w:numFmt w:val="bullet"/>
+      <w:lvlText w:val=""/>
+      <w:lvlJc w:val="left"/>
+      <w:pPr>
+        <w:tabs>
+          <w:tab w:val="num" w:pos="2880"/>
+        </w:tabs>
+        <w:ind w:left="2880" w:hanging="360"/>
+      </w:pPr>
+      <w:rPr>
+        <w:rFonts w:ascii="Wingdings" w:hAnsi="Wingdings" w:hint="default"/>
+        <w:sz w:val="20"/>
+      </w:rPr>
+    </w:lvl>
+    <w:lvl w:ilvl="4" w:tentative="1">
+      <w:start w:val="1"/>
+      <w:numFmt w:val="bullet"/>
+      <w:lvlText w:val=""/>
+      <w:lvlJc w:val="left"/>
+      <w:pPr>
+        <w:tabs>
+          <w:tab w:val="num" w:pos="3600"/>
+        </w:tabs>
+        <w:ind w:left="3600" w:hanging="360"/>
+      </w:pPr>
+      <w:rPr>
+        <w:rFonts w:ascii="Wingdings" w:hAnsi="Wingdings" w:hint="default"/>
+        <w:sz w:val="20"/>
+      </w:rPr>
+    </w:lvl>
+    <w:lvl w:ilvl="5" w:tentative="1">
+      <w:start w:val="1"/>
+      <w:numFmt w:val="bullet"/>
+      <w:lvlText w:val=""/>
+      <w:lvlJc w:val="left"/>
+      <w:pPr>
+        <w:tabs>
+          <w:tab w:val="num" w:pos="4320"/>
+        </w:tabs>
+        <w:ind w:left="4320" w:hanging="360"/>
+      </w:pPr>
+      <w:rPr>
+        <w:rFonts w:ascii="Wingdings" w:hAnsi="Wingdings" w:hint="default"/>
+        <w:sz w:val="20"/>
+      </w:rPr>
+    </w:lvl>
+    <w:lvl w:ilvl="6" w:tentative="1">
+      <w:start w:val="1"/>
+      <w:numFmt w:val="bullet"/>
+      <w:lvlText w:val=""/>
+      <w:lvlJc w:val="left"/>
+      <w:pPr>
+        <w:tabs>
+          <w:tab w:val="num" w:pos="5040"/>
+        </w:tabs>
+        <w:ind w:left="5040" w:hanging="360"/>
+      </w:pPr>
+      <w:rPr>
+        <w:rFonts w:ascii="Wingdings" w:hAnsi="Wingdings" w:hint="default"/>
+        <w:sz w:val="20"/>
+      </w:rPr>
+    </w:lvl>
+    <w:lvl w:ilvl="7" w:tentative="1">
+      <w:start w:val="1"/>
+      <w:numFmt w:val="bullet"/>
+      <w:lvlText w:val=""/>
+      <w:lvlJc w:val="left"/>
+      <w:pPr>
+        <w:tabs>
+          <w:tab w:val="num" w:pos="5760"/>
+        </w:tabs>
+        <w:ind w:left="5760" w:hanging="360"/>
+      </w:pPr>
+      <w:rPr>
+        <w:rFonts w:ascii="Wingdings" w:hAnsi="Wingdings" w:hint="default"/>
+        <w:sz w:val="20"/>
+      </w:rPr>
+    </w:lvl>
+    <w:lvl w:ilvl="8" w:tentative="1">
+      <w:start w:val="1"/>
+      <w:numFmt w:val="bullet"/>
+      <w:lvlText w:val=""/>
+      <w:lvlJc w:val="left"/>
+      <w:pPr>
+        <w:tabs>
+          <w:tab w:val="num" w:pos="6480"/>
+        </w:tabs>
+        <w:ind w:left="6480" w:hanging="360"/>
+      </w:pPr>
+      <w:rPr>
+        <w:rFonts w:ascii="Wingdings" w:hAnsi="Wingdings" w:hint="default"/>
+        <w:sz w:val="20"/>
+      </w:rPr>
+    </w:lvl>
+  </w:abstractNum>
+  <w:abstractNum w:abstractNumId="3">
+    <w:nsid w:val="260C45B8"/>
+    <w:multiLevelType w:val="multilevel"/>
+    <w:tmpl w:val="B4328A10"/>
+    <w:lvl w:ilvl="0">
+      <w:start w:val="1"/>
+      <w:numFmt w:val="decimal"/>
+      <w:lvlText w:val="%1."/>
+      <w:lvlJc w:val="left"/>
+      <w:pPr>
+        <w:tabs>
+          <w:tab w:val="num" w:pos="720"/>
+        </w:tabs>
+        <w:ind w:left="720" w:hanging="360"/>
+      </w:pPr>
+    </w:lvl>
+    <w:lvl w:ilvl="1">
+      <w:start w:val="1"/>
+      <w:numFmt w:val="bullet"/>
+      <w:lvlText w:val="o"/>
+      <w:lvlJc w:val="left"/>
+      <w:pPr>
+        <w:tabs>
+          <w:tab w:val="num" w:pos="1440"/>
+        </w:tabs>
+        <w:ind w:left="1440" w:hanging="360"/>
+      </w:pPr>
+      <w:rPr>
+        <w:rFonts w:ascii="Courier New" w:hAnsi="Courier New" w:hint="default"/>
+        <w:sz w:val="20"/>
+      </w:rPr>
+    </w:lvl>
+    <w:lvl w:ilvl="2" w:tentative="1">
+      <w:start w:val="1"/>
+      <w:numFmt w:val="decimal"/>
+      <w:lvlText w:val="%3."/>
+      <w:lvlJc w:val="left"/>
+      <w:pPr>
+        <w:tabs>
+          <w:tab w:val="num" w:pos="2160"/>
+        </w:tabs>
+        <w:ind w:left="2160" w:hanging="360"/>
+      </w:pPr>
+    </w:lvl>
+    <w:lvl w:ilvl="3" w:tentative="1">
+      <w:start w:val="1"/>
+      <w:numFmt w:val="decimal"/>
+      <w:lvlText w:val="%4."/>
+      <w:lvlJc w:val="left"/>
+      <w:pPr>
+        <w:tabs>
+          <w:tab w:val="num" w:pos="2880"/>
+        </w:tabs>
+        <w:ind w:left="2880" w:hanging="360"/>
+      </w:pPr>
+    </w:lvl>
+    <w:lvl w:ilvl="4" w:tentative="1">
+      <w:start w:val="1"/>
+      <w:numFmt w:val="decimal"/>
+      <w:lvlText w:val="%5."/>
+      <w:lvlJc w:val="left"/>
+      <w:pPr>
+        <w:tabs>
+          <w:tab w:val="num" w:pos="3600"/>
+        </w:tabs>
+        <w:ind w:left="3600" w:hanging="360"/>
+      </w:pPr>
+    </w:lvl>
+    <w:lvl w:ilvl="5" w:tentative="1">
+      <w:start w:val="1"/>
+      <w:numFmt w:val="decimal"/>
+      <w:lvlText w:val="%6."/>
+      <w:lvlJc w:val="left"/>
+      <w:pPr>
+        <w:tabs>
+          <w:tab w:val="num" w:pos="4320"/>
+        </w:tabs>
+        <w:ind w:left="4320" w:hanging="360"/>
+      </w:pPr>
+    </w:lvl>
+    <w:lvl w:ilvl="6" w:tentative="1">
+      <w:start w:val="1"/>
+      <w:numFmt w:val="decimal"/>
+      <w:lvlText w:val="%7."/>
+      <w:lvlJc w:val="left"/>
+      <w:pPr>
+        <w:tabs>
+          <w:tab w:val="num" w:pos="5040"/>
+        </w:tabs>
+        <w:ind w:left="5040" w:hanging="360"/>
+      </w:pPr>
+    </w:lvl>
+    <w:lvl w:ilvl="7" w:tentative="1">
+      <w:start w:val="1"/>
+      <w:numFmt w:val="decimal"/>
+      <w:lvlText w:val="%8."/>
+      <w:lvlJc w:val="left"/>
+      <w:pPr>
+        <w:tabs>
+          <w:tab w:val="num" w:pos="5760"/>
+        </w:tabs>
+        <w:ind w:left="5760" w:hanging="360"/>
+      </w:pPr>
+    </w:lvl>
+    <w:lvl w:ilvl="8" w:tentative="1">
+      <w:start w:val="1"/>
+      <w:numFmt w:val="decimal"/>
+      <w:lvlText w:val="%9."/>
+      <w:lvlJc w:val="left"/>
+      <w:pPr>
+        <w:tabs>
+          <w:tab w:val="num" w:pos="6480"/>
+        </w:tabs>
+        <w:ind w:left="6480" w:hanging="360"/>
+      </w:pPr>
+    </w:lvl>
+  </w:abstractNum>
+  <w:abstractNum w:abstractNumId="4">
     <w:nsid w:val="33B8566C"/>
     <w:multiLevelType w:val="multilevel"/>
     <w:tmpl w:val="7610E262"/>
@@ -3182,7 +5154,7 @@
       </w:rPr>
     </w:lvl>
   </w:abstractNum>
-  <w:abstractNum w:abstractNumId="2">
+  <w:abstractNum w:abstractNumId="5">
     <w:nsid w:val="39D14922"/>
     <w:multiLevelType w:val="multilevel"/>
     <w:tmpl w:val="D3781D12"/>
@@ -3331,7 +5303,7 @@
       </w:rPr>
     </w:lvl>
   </w:abstractNum>
-  <w:abstractNum w:abstractNumId="3">
+  <w:abstractNum w:abstractNumId="6">
     <w:nsid w:val="3FFC6B9F"/>
     <w:multiLevelType w:val="multilevel"/>
     <w:tmpl w:val="EF229C52"/>
@@ -3480,7 +5452,7 @@
       </w:rPr>
     </w:lvl>
   </w:abstractNum>
-  <w:abstractNum w:abstractNumId="4">
+  <w:abstractNum w:abstractNumId="7">
     <w:nsid w:val="424F0348"/>
     <w:multiLevelType w:val="multilevel"/>
     <w:tmpl w:val="376EC408"/>
@@ -3597,7 +5569,7 @@
       </w:pPr>
     </w:lvl>
   </w:abstractNum>
-  <w:abstractNum w:abstractNumId="5">
+  <w:abstractNum w:abstractNumId="8">
     <w:nsid w:val="44ED6818"/>
     <w:multiLevelType w:val="multilevel"/>
     <w:tmpl w:val="3CE48472"/>
@@ -3746,7 +5718,156 @@
       </w:rPr>
     </w:lvl>
   </w:abstractNum>
-  <w:abstractNum w:abstractNumId="6">
+  <w:abstractNum w:abstractNumId="9">
+    <w:nsid w:val="4A1C564B"/>
+    <w:multiLevelType w:val="multilevel"/>
+    <w:tmpl w:val="7B640C66"/>
+    <w:lvl w:ilvl="0">
+      <w:start w:val="1"/>
+      <w:numFmt w:val="bullet"/>
+      <w:lvlText w:val=""/>
+      <w:lvlJc w:val="left"/>
+      <w:pPr>
+        <w:tabs>
+          <w:tab w:val="num" w:pos="720"/>
+        </w:tabs>
+        <w:ind w:left="720" w:hanging="360"/>
+      </w:pPr>
+      <w:rPr>
+        <w:rFonts w:ascii="Symbol" w:hAnsi="Symbol" w:hint="default"/>
+        <w:sz w:val="20"/>
+      </w:rPr>
+    </w:lvl>
+    <w:lvl w:ilvl="1" w:tentative="1">
+      <w:start w:val="1"/>
+      <w:numFmt w:val="bullet"/>
+      <w:lvlText w:val="o"/>
+      <w:lvlJc w:val="left"/>
+      <w:pPr>
+        <w:tabs>
+          <w:tab w:val="num" w:pos="1440"/>
+        </w:tabs>
+        <w:ind w:left="1440" w:hanging="360"/>
+      </w:pPr>
+      <w:rPr>
+        <w:rFonts w:ascii="Courier New" w:hAnsi="Courier New" w:hint="default"/>
+        <w:sz w:val="20"/>
+      </w:rPr>
+    </w:lvl>
+    <w:lvl w:ilvl="2" w:tentative="1">
+      <w:start w:val="1"/>
+      <w:numFmt w:val="bullet"/>
+      <w:lvlText w:val=""/>
+      <w:lvlJc w:val="left"/>
+      <w:pPr>
+        <w:tabs>
+          <w:tab w:val="num" w:pos="2160"/>
+        </w:tabs>
+        <w:ind w:left="2160" w:hanging="360"/>
+      </w:pPr>
+      <w:rPr>
+        <w:rFonts w:ascii="Wingdings" w:hAnsi="Wingdings" w:hint="default"/>
+        <w:sz w:val="20"/>
+      </w:rPr>
+    </w:lvl>
+    <w:lvl w:ilvl="3" w:tentative="1">
+      <w:start w:val="1"/>
+      <w:numFmt w:val="bullet"/>
+      <w:lvlText w:val=""/>
+      <w:lvlJc w:val="left"/>
+      <w:pPr>
+        <w:tabs>
+          <w:tab w:val="num" w:pos="2880"/>
+        </w:tabs>
+        <w:ind w:left="2880" w:hanging="360"/>
+      </w:pPr>
+      <w:rPr>
+        <w:rFonts w:ascii="Wingdings" w:hAnsi="Wingdings" w:hint="default"/>
+        <w:sz w:val="20"/>
+      </w:rPr>
+    </w:lvl>
+    <w:lvl w:ilvl="4" w:tentative="1">
+      <w:start w:val="1"/>
+      <w:numFmt w:val="bullet"/>
+      <w:lvlText w:val=""/>
+      <w:lvlJc w:val="left"/>
+      <w:pPr>
+        <w:tabs>
+          <w:tab w:val="num" w:pos="3600"/>
+        </w:tabs>
+        <w:ind w:left="3600" w:hanging="360"/>
+      </w:pPr>
+      <w:rPr>
+        <w:rFonts w:ascii="Wingdings" w:hAnsi="Wingdings" w:hint="default"/>
+        <w:sz w:val="20"/>
+      </w:rPr>
+    </w:lvl>
+    <w:lvl w:ilvl="5" w:tentative="1">
+      <w:start w:val="1"/>
+      <w:numFmt w:val="bullet"/>
+      <w:lvlText w:val=""/>
+      <w:lvlJc w:val="left"/>
+      <w:pPr>
+        <w:tabs>
+          <w:tab w:val="num" w:pos="4320"/>
+        </w:tabs>
+        <w:ind w:left="4320" w:hanging="360"/>
+      </w:pPr>
+      <w:rPr>
+        <w:rFonts w:ascii="Wingdings" w:hAnsi="Wingdings" w:hint="default"/>
+        <w:sz w:val="20"/>
+      </w:rPr>
+    </w:lvl>
+    <w:lvl w:ilvl="6" w:tentative="1">
+      <w:start w:val="1"/>
+      <w:numFmt w:val="bullet"/>
+      <w:lvlText w:val=""/>
+      <w:lvlJc w:val="left"/>
+      <w:pPr>
+        <w:tabs>
+          <w:tab w:val="num" w:pos="5040"/>
+        </w:tabs>
+        <w:ind w:left="5040" w:hanging="360"/>
+      </w:pPr>
+      <w:rPr>
+        <w:rFonts w:ascii="Wingdings" w:hAnsi="Wingdings" w:hint="default"/>
+        <w:sz w:val="20"/>
+      </w:rPr>
+    </w:lvl>
+    <w:lvl w:ilvl="7" w:tentative="1">
+      <w:start w:val="1"/>
+      <w:numFmt w:val="bullet"/>
+      <w:lvlText w:val=""/>
+      <w:lvlJc w:val="left"/>
+      <w:pPr>
+        <w:tabs>
+          <w:tab w:val="num" w:pos="5760"/>
+        </w:tabs>
+        <w:ind w:left="5760" w:hanging="360"/>
+      </w:pPr>
+      <w:rPr>
+        <w:rFonts w:ascii="Wingdings" w:hAnsi="Wingdings" w:hint="default"/>
+        <w:sz w:val="20"/>
+      </w:rPr>
+    </w:lvl>
+    <w:lvl w:ilvl="8" w:tentative="1">
+      <w:start w:val="1"/>
+      <w:numFmt w:val="bullet"/>
+      <w:lvlText w:val=""/>
+      <w:lvlJc w:val="left"/>
+      <w:pPr>
+        <w:tabs>
+          <w:tab w:val="num" w:pos="6480"/>
+        </w:tabs>
+        <w:ind w:left="6480" w:hanging="360"/>
+      </w:pPr>
+      <w:rPr>
+        <w:rFonts w:ascii="Wingdings" w:hAnsi="Wingdings" w:hint="default"/>
+        <w:sz w:val="20"/>
+      </w:rPr>
+    </w:lvl>
+  </w:abstractNum>
+  <w:abstractNum w:abstractNumId="10">
     <w:nsid w:val="4B391E40"/>
     <w:multiLevelType w:val="multilevel"/>
     <w:tmpl w:val="5F92D24E"/>
@@ -3895,7 +6016,7 @@
       </w:rPr>
     </w:lvl>
   </w:abstractNum>
-  <w:abstractNum w:abstractNumId="7">
+  <w:abstractNum w:abstractNumId="11">
     <w:nsid w:val="659F5510"/>
     <w:multiLevelType w:val="multilevel"/>
     <w:tmpl w:val="FF400568"/>
@@ -4044,7 +6165,7 @@
       </w:rPr>
     </w:lvl>
   </w:abstractNum>
-  <w:abstractNum w:abstractNumId="8">
+  <w:abstractNum w:abstractNumId="12">
     <w:nsid w:val="6C390872"/>
     <w:multiLevelType w:val="multilevel"/>
     <w:tmpl w:val="4E628158"/>
@@ -4193,7 +6314,7 @@
       </w:rPr>
     </w:lvl>
   </w:abstractNum>
-  <w:abstractNum w:abstractNumId="9">
+  <w:abstractNum w:abstractNumId="13">
     <w:nsid w:val="70CD3096"/>
     <w:multiLevelType w:val="multilevel"/>
     <w:tmpl w:val="48CA04CA"/>
@@ -4343,34 +6464,46 @@
     </w:lvl>
   </w:abstractNum>
   <w:num w:numId="1">
+    <w:abstractNumId w:val="13"/>
+  </w:num>
+  <w:num w:numId="2">
+    <w:abstractNumId w:val="1"/>
+  </w:num>
+  <w:num w:numId="3">
+    <w:abstractNumId w:val="11"/>
+  </w:num>
+  <w:num w:numId="4">
+    <w:abstractNumId w:val="12"/>
+  </w:num>
+  <w:num w:numId="5">
+    <w:abstractNumId w:val="6"/>
+  </w:num>
+  <w:num w:numId="6">
+    <w:abstractNumId w:val="5"/>
+  </w:num>
+  <w:num w:numId="7">
+    <w:abstractNumId w:val="10"/>
+  </w:num>
+  <w:num w:numId="8">
+    <w:abstractNumId w:val="8"/>
+  </w:num>
+  <w:num w:numId="9">
+    <w:abstractNumId w:val="4"/>
+  </w:num>
+  <w:num w:numId="10">
+    <w:abstractNumId w:val="7"/>
+  </w:num>
+  <w:num w:numId="11">
+    <w:abstractNumId w:val="2"/>
+  </w:num>
+  <w:num w:numId="12">
     <w:abstractNumId w:val="9"/>
   </w:num>
-  <w:num w:numId="2">
+  <w:num w:numId="13">
     <w:abstractNumId w:val="0"/>
   </w:num>
-  <w:num w:numId="3">
-    <w:abstractNumId w:val="7"/>
-  </w:num>
-  <w:num w:numId="4">
-    <w:abstractNumId w:val="8"/>
-  </w:num>
-  <w:num w:numId="5">
+  <w:num w:numId="14">
     <w:abstractNumId w:val="3"/>
-  </w:num>
-  <w:num w:numId="6">
-    <w:abstractNumId w:val="2"/>
-  </w:num>
-  <w:num w:numId="7">
-    <w:abstractNumId w:val="6"/>
-  </w:num>
-  <w:num w:numId="8">
-    <w:abstractNumId w:val="5"/>
-  </w:num>
-  <w:num w:numId="9">
-    <w:abstractNumId w:val="1"/>
-  </w:num>
-  <w:num w:numId="10">
-    <w:abstractNumId w:val="4"/>
   </w:num>
 </w:numbering>
 </file>

</xml_diff>